<commit_message>
Shrink Experience Letter's Responsibility bullet font by 1.5pt
The four "Responsibility" bullets were 10.5pt (sz="21"); dropped to
9pt (sz="18") as requested. Scoped to just those four bullet
paragraphs' own runs (bullet glyph, tab, and placeholder text each
carry their own sz/szCs) — nothing else in the template uses this
size, so no risk of touching unrelated text.

Verified by downloading a real generated .docx through the running
app and confirming sz="18" on the actual rendered bullet text (not
just the source template) — the local preview pipeline used for a
visual check doesn't preserve exact run-level font sizes, so it
wasn't reliable evidence here; the raw XML is.

Co-Authored-By: Claude Sonnet 5 <noreply@anthropic.com>
Claude-Session: https://claude.ai/code/session_01MEHPF7p4Mvi3Bv2am4sPQK
</commit_message>
<xml_diff>
--- a/hr-ai-interviewer/backend/src/templates/experience-letter.docx
+++ b/hr-ai-interviewer/backend/src/templates/experience-letter.docx
@@ -707,8 +707,8 @@
                 <w:rFonts w:ascii="Sylfaen" w:hAnsi="Sylfaen"/>
                 <w:iCs/>
                 <w:color w:val="555555"/>
-                <w:sz w:val="21"/>
-                <w:szCs w:val="21"/>
+                <w:sz w:val="18"/>
+                <w:szCs w:val="18"/>
               </w:rPr>
             </w:pPr>
             <w:r>
@@ -716,8 +716,8 @@
                 <w:rFonts w:ascii="Sylfaen" w:hAnsi="Sylfaen"/>
                 <w:iCs/>
                 <w:color w:val="555555"/>
-                <w:sz w:val="21"/>
-                <w:szCs w:val="21"/>
+                <w:sz w:val="18"/>
+                <w:szCs w:val="18"/>
               </w:rPr>
               <w:t>•</w:t>
             </w:r>
@@ -726,8 +726,8 @@
                 <w:rFonts w:ascii="Sylfaen" w:hAnsi="Sylfaen"/>
                 <w:iCs/>
                 <w:color w:val="555555"/>
-                <w:sz w:val="21"/>
-                <w:szCs w:val="21"/>
+                <w:sz w:val="18"/>
+                <w:szCs w:val="18"/>
               </w:rPr>
               <w:tab/>
               <w:t>[Responsibility 1 – factual, role-based]</w:t>
@@ -739,8 +739,8 @@
                 <w:rFonts w:ascii="Sylfaen" w:hAnsi="Sylfaen"/>
                 <w:iCs/>
                 <w:color w:val="555555"/>
-                <w:sz w:val="21"/>
-                <w:szCs w:val="21"/>
+                <w:sz w:val="18"/>
+                <w:szCs w:val="18"/>
               </w:rPr>
             </w:pPr>
             <w:r>
@@ -748,8 +748,8 @@
                 <w:rFonts w:ascii="Sylfaen" w:hAnsi="Sylfaen"/>
                 <w:iCs/>
                 <w:color w:val="555555"/>
-                <w:sz w:val="21"/>
-                <w:szCs w:val="21"/>
+                <w:sz w:val="18"/>
+                <w:szCs w:val="18"/>
               </w:rPr>
               <w:t>•</w:t>
             </w:r>
@@ -758,8 +758,8 @@
                 <w:rFonts w:ascii="Sylfaen" w:hAnsi="Sylfaen"/>
                 <w:iCs/>
                 <w:color w:val="555555"/>
-                <w:sz w:val="21"/>
-                <w:szCs w:val="21"/>
+                <w:sz w:val="18"/>
+                <w:szCs w:val="18"/>
               </w:rPr>
               <w:tab/>
               <w:t>[Responsibility 2 – factual, role-based]</w:t>
@@ -771,8 +771,8 @@
                 <w:rFonts w:ascii="Sylfaen" w:hAnsi="Sylfaen"/>
                 <w:iCs/>
                 <w:color w:val="555555"/>
-                <w:sz w:val="21"/>
-                <w:szCs w:val="21"/>
+                <w:sz w:val="18"/>
+                <w:szCs w:val="18"/>
               </w:rPr>
             </w:pPr>
             <w:r>
@@ -780,8 +780,8 @@
                 <w:rFonts w:ascii="Sylfaen" w:hAnsi="Sylfaen"/>
                 <w:iCs/>
                 <w:color w:val="555555"/>
-                <w:sz w:val="21"/>
-                <w:szCs w:val="21"/>
+                <w:sz w:val="18"/>
+                <w:szCs w:val="18"/>
               </w:rPr>
               <w:t>•</w:t>
             </w:r>
@@ -790,8 +790,8 @@
                 <w:rFonts w:ascii="Sylfaen" w:hAnsi="Sylfaen"/>
                 <w:iCs/>
                 <w:color w:val="555555"/>
-                <w:sz w:val="21"/>
-                <w:szCs w:val="21"/>
+                <w:sz w:val="18"/>
+                <w:szCs w:val="18"/>
               </w:rPr>
               <w:tab/>
               <w:t>[Responsibility 3 – factual, role-based]</w:t>
@@ -801,8 +801,8 @@
             <w:pPr>
               <w:rPr>
                 <w:rFonts w:ascii="Sylfaen" w:hAnsi="Sylfaen"/>
-                <w:sz w:val="21"/>
-                <w:szCs w:val="21"/>
+                <w:sz w:val="18"/>
+                <w:szCs w:val="18"/>
               </w:rPr>
             </w:pPr>
             <w:r>
@@ -810,8 +810,8 @@
                 <w:rFonts w:ascii="Sylfaen" w:hAnsi="Sylfaen"/>
                 <w:iCs/>
                 <w:color w:val="555555"/>
-                <w:sz w:val="21"/>
-                <w:szCs w:val="21"/>
+                <w:sz w:val="18"/>
+                <w:szCs w:val="18"/>
               </w:rPr>
               <w:t>•</w:t>
             </w:r>
@@ -820,8 +820,8 @@
                 <w:rFonts w:ascii="Sylfaen" w:hAnsi="Sylfaen"/>
                 <w:iCs/>
                 <w:color w:val="555555"/>
-                <w:sz w:val="21"/>
-                <w:szCs w:val="21"/>
+                <w:sz w:val="18"/>
+                <w:szCs w:val="18"/>
               </w:rPr>
               <w:tab/>
               <w:t>[Responsibility 4 – factual, role-based]</w:t>

</xml_diff>